<commit_message>
Lab 01 Task: 02
</commit_message>
<xml_diff>
--- a/Labs/Lab 1/lab 01 answer doc.docx
+++ b/Labs/Lab 1/lab 01 answer doc.docx
@@ -132,6 +132,7 @@
       <w:r>
         <w:rPr>
           <w:rFonts w:ascii="Times New Roman" w:hAnsi="Times New Roman" w:cs="Times New Roman"/>
+          <w:noProof/>
           <w:sz w:val="44"/>
           <w:szCs w:val="44"/>
         </w:rPr>
@@ -184,6 +185,7 @@
       <w:r>
         <w:rPr>
           <w:rFonts w:ascii="Times New Roman" w:hAnsi="Times New Roman" w:cs="Times New Roman"/>
+          <w:noProof/>
           <w:sz w:val="44"/>
           <w:szCs w:val="44"/>
         </w:rPr>
@@ -223,6 +225,249 @@
           </wp:inline>
         </w:drawing>
       </w:r>
+    </w:p>
+    <w:p>
+      <w:pPr>
+        <w:jc w:val="center"/>
+        <w:rPr>
+          <w:rFonts w:ascii="Times New Roman" w:hAnsi="Times New Roman" w:cs="Times New Roman"/>
+          <w:sz w:val="44"/>
+          <w:szCs w:val="44"/>
+        </w:rPr>
+      </w:pPr>
+    </w:p>
+    <w:p>
+      <w:pPr>
+        <w:jc w:val="center"/>
+        <w:rPr>
+          <w:rFonts w:ascii="Times New Roman" w:hAnsi="Times New Roman" w:cs="Times New Roman"/>
+          <w:sz w:val="44"/>
+          <w:szCs w:val="44"/>
+        </w:rPr>
+      </w:pPr>
+    </w:p>
+    <w:p>
+      <w:pPr>
+        <w:jc w:val="center"/>
+        <w:rPr>
+          <w:rFonts w:ascii="Times New Roman" w:hAnsi="Times New Roman" w:cs="Times New Roman"/>
+          <w:sz w:val="44"/>
+          <w:szCs w:val="44"/>
+        </w:rPr>
+      </w:pPr>
+    </w:p>
+    <w:p>
+      <w:pPr>
+        <w:jc w:val="center"/>
+        <w:rPr>
+          <w:rFonts w:ascii="Times New Roman" w:hAnsi="Times New Roman" w:cs="Times New Roman"/>
+          <w:sz w:val="44"/>
+          <w:szCs w:val="44"/>
+        </w:rPr>
+      </w:pPr>
+      <w:r>
+        <w:rPr>
+          <w:rFonts w:ascii="Times New Roman" w:hAnsi="Times New Roman" w:cs="Times New Roman"/>
+          <w:sz w:val="44"/>
+          <w:szCs w:val="44"/>
+        </w:rPr>
+        <w:lastRenderedPageBreak/>
+        <w:t>Task: 2</w:t>
+      </w:r>
+    </w:p>
+    <w:p>
+      <w:pPr>
+        <w:jc w:val="center"/>
+        <w:rPr>
+          <w:rFonts w:ascii="Times New Roman" w:hAnsi="Times New Roman" w:cs="Times New Roman"/>
+          <w:sz w:val="32"/>
+          <w:szCs w:val="32"/>
+        </w:rPr>
+      </w:pPr>
+      <w:r>
+        <w:rPr>
+          <w:rFonts w:ascii="Times New Roman" w:hAnsi="Times New Roman" w:cs="Times New Roman"/>
+          <w:sz w:val="32"/>
+          <w:szCs w:val="32"/>
+        </w:rPr>
+        <w:t xml:space="preserve">Declare int </w:t>
+      </w:r>
+      <w:proofErr w:type="gramStart"/>
+      <w:r>
+        <w:rPr>
+          <w:rFonts w:ascii="Times New Roman" w:hAnsi="Times New Roman" w:cs="Times New Roman"/>
+          <w:sz w:val="32"/>
+          <w:szCs w:val="32"/>
+        </w:rPr>
+        <w:t>numbers[</w:t>
+      </w:r>
+      <w:proofErr w:type="gramEnd"/>
+      <w:r>
+        <w:rPr>
+          <w:rFonts w:ascii="Times New Roman" w:hAnsi="Times New Roman" w:cs="Times New Roman"/>
+          <w:sz w:val="32"/>
+          <w:szCs w:val="32"/>
+        </w:rPr>
+        <w:t xml:space="preserve">5]; and initialise int total = </w:t>
+      </w:r>
+      <w:proofErr w:type="gramStart"/>
+      <w:r>
+        <w:rPr>
+          <w:rFonts w:ascii="Times New Roman" w:hAnsi="Times New Roman" w:cs="Times New Roman"/>
+          <w:sz w:val="32"/>
+          <w:szCs w:val="32"/>
+        </w:rPr>
+        <w:t>0;.</w:t>
+      </w:r>
+      <w:proofErr w:type="gramEnd"/>
+      <w:r>
+        <w:rPr>
+          <w:rFonts w:ascii="Times New Roman" w:hAnsi="Times New Roman" w:cs="Times New Roman"/>
+          <w:sz w:val="32"/>
+          <w:szCs w:val="32"/>
+        </w:rPr>
+        <w:t xml:space="preserve"> Use one loop to read five integers into the array and a second loop to add them to total. Display the total. Assume the user enters exactly five valid integers whose sum fits in int</w:t>
+      </w:r>
+      <w:r>
+        <w:rPr>
+          <w:rFonts w:ascii="Times New Roman" w:hAnsi="Times New Roman" w:cs="Times New Roman"/>
+          <w:sz w:val="32"/>
+          <w:szCs w:val="32"/>
+        </w:rPr>
+        <w:t>.</w:t>
+      </w:r>
+    </w:p>
+    <w:p>
+      <w:pPr>
+        <w:jc w:val="center"/>
+        <w:rPr>
+          <w:rFonts w:ascii="Times New Roman" w:hAnsi="Times New Roman" w:cs="Times New Roman"/>
+          <w:sz w:val="32"/>
+          <w:szCs w:val="32"/>
+        </w:rPr>
+      </w:pPr>
+      <w:r>
+        <w:rPr>
+          <w:rFonts w:ascii="Times New Roman" w:hAnsi="Times New Roman" w:cs="Times New Roman"/>
+          <w:sz w:val="32"/>
+          <w:szCs w:val="32"/>
+        </w:rPr>
+        <w:drawing>
+          <wp:inline distT="0" distB="0" distL="0" distR="0" wp14:anchorId="1C73F800" wp14:editId="27FDD691">
+            <wp:extent cx="5855001" cy="4381725"/>
+            <wp:effectExtent l="0" t="0" r="0" b="0"/>
+            <wp:docPr id="1732423630" name="Picture 1"/>
+            <wp:cNvGraphicFramePr>
+              <a:graphicFrameLocks xmlns:a="http://schemas.openxmlformats.org/drawingml/2006/main" noChangeAspect="1"/>
+            </wp:cNvGraphicFramePr>
+            <a:graphic xmlns:a="http://schemas.openxmlformats.org/drawingml/2006/main">
+              <a:graphicData uri="http://schemas.openxmlformats.org/drawingml/2006/picture">
+                <pic:pic xmlns:pic="http://schemas.openxmlformats.org/drawingml/2006/picture">
+                  <pic:nvPicPr>
+                    <pic:cNvPr id="1732423630" name=""/>
+                    <pic:cNvPicPr/>
+                  </pic:nvPicPr>
+                  <pic:blipFill>
+                    <a:blip r:embed="rId6"/>
+                    <a:stretch>
+                      <a:fillRect/>
+                    </a:stretch>
+                  </pic:blipFill>
+                  <pic:spPr>
+                    <a:xfrm>
+                      <a:off x="0" y="0"/>
+                      <a:ext cx="5855001" cy="4381725"/>
+                    </a:xfrm>
+                    <a:prstGeom prst="rect">
+                      <a:avLst/>
+                    </a:prstGeom>
+                  </pic:spPr>
+                </pic:pic>
+              </a:graphicData>
+            </a:graphic>
+          </wp:inline>
+        </w:drawing>
+      </w:r>
+    </w:p>
+    <w:p>
+      <w:pPr>
+        <w:jc w:val="center"/>
+        <w:rPr>
+          <w:rFonts w:ascii="Times New Roman" w:hAnsi="Times New Roman" w:cs="Times New Roman"/>
+          <w:sz w:val="32"/>
+          <w:szCs w:val="32"/>
+        </w:rPr>
+      </w:pPr>
+      <w:r>
+        <w:rPr>
+          <w:rFonts w:ascii="Times New Roman" w:hAnsi="Times New Roman" w:cs="Times New Roman"/>
+          <w:sz w:val="32"/>
+          <w:szCs w:val="32"/>
+        </w:rPr>
+        <w:drawing>
+          <wp:inline distT="0" distB="0" distL="0" distR="0" wp14:anchorId="5C0002C8" wp14:editId="0777ACF1">
+            <wp:extent cx="6026460" cy="838243"/>
+            <wp:effectExtent l="0" t="0" r="0" b="0"/>
+            <wp:docPr id="3728648" name="Picture 1"/>
+            <wp:cNvGraphicFramePr>
+              <a:graphicFrameLocks xmlns:a="http://schemas.openxmlformats.org/drawingml/2006/main" noChangeAspect="1"/>
+            </wp:cNvGraphicFramePr>
+            <a:graphic xmlns:a="http://schemas.openxmlformats.org/drawingml/2006/main">
+              <a:graphicData uri="http://schemas.openxmlformats.org/drawingml/2006/picture">
+                <pic:pic xmlns:pic="http://schemas.openxmlformats.org/drawingml/2006/picture">
+                  <pic:nvPicPr>
+                    <pic:cNvPr id="3728648" name=""/>
+                    <pic:cNvPicPr/>
+                  </pic:nvPicPr>
+                  <pic:blipFill>
+                    <a:blip r:embed="rId7"/>
+                    <a:stretch>
+                      <a:fillRect/>
+                    </a:stretch>
+                  </pic:blipFill>
+                  <pic:spPr>
+                    <a:xfrm>
+                      <a:off x="0" y="0"/>
+                      <a:ext cx="6026460" cy="838243"/>
+                    </a:xfrm>
+                    <a:prstGeom prst="rect">
+                      <a:avLst/>
+                    </a:prstGeom>
+                  </pic:spPr>
+                </pic:pic>
+              </a:graphicData>
+            </a:graphic>
+          </wp:inline>
+        </w:drawing>
+      </w:r>
+    </w:p>
+    <w:p>
+      <w:pPr>
+        <w:jc w:val="center"/>
+        <w:rPr>
+          <w:rFonts w:ascii="Times New Roman" w:hAnsi="Times New Roman" w:cs="Times New Roman"/>
+          <w:sz w:val="44"/>
+          <w:szCs w:val="44"/>
+        </w:rPr>
+      </w:pPr>
+      <w:r>
+        <w:rPr>
+          <w:rFonts w:ascii="Times New Roman" w:hAnsi="Times New Roman" w:cs="Times New Roman"/>
+          <w:sz w:val="44"/>
+          <w:szCs w:val="44"/>
+        </w:rPr>
+        <w:t>Task: 3</w:t>
+      </w:r>
+    </w:p>
+    <w:p>
+      <w:pPr>
+        <w:jc w:val="center"/>
+        <w:rPr>
+          <w:rFonts w:ascii="Times New Roman" w:hAnsi="Times New Roman" w:cs="Times New Roman"/>
+          <w:sz w:val="44"/>
+          <w:szCs w:val="44"/>
+        </w:rPr>
+      </w:pPr>
     </w:p>
     <w:sectPr>
       <w:pgSz w:w="15840" w:h="24480" w:code="3"/>

</xml_diff>

<commit_message>
Lab 01 Task: 03
</commit_message>
<xml_diff>
--- a/Labs/Lab 1/lab 01 answer doc.docx
+++ b/Labs/Lab 1/lab 01 answer doc.docx
@@ -290,43 +290,7 @@
           <w:sz w:val="32"/>
           <w:szCs w:val="32"/>
         </w:rPr>
-        <w:t xml:space="preserve">Declare int </w:t>
-      </w:r>
-      <w:proofErr w:type="gramStart"/>
-      <w:r>
-        <w:rPr>
-          <w:rFonts w:ascii="Times New Roman" w:hAnsi="Times New Roman" w:cs="Times New Roman"/>
-          <w:sz w:val="32"/>
-          <w:szCs w:val="32"/>
-        </w:rPr>
-        <w:t>numbers[</w:t>
-      </w:r>
-      <w:proofErr w:type="gramEnd"/>
-      <w:r>
-        <w:rPr>
-          <w:rFonts w:ascii="Times New Roman" w:hAnsi="Times New Roman" w:cs="Times New Roman"/>
-          <w:sz w:val="32"/>
-          <w:szCs w:val="32"/>
-        </w:rPr>
-        <w:t xml:space="preserve">5]; and initialise int total = </w:t>
-      </w:r>
-      <w:proofErr w:type="gramStart"/>
-      <w:r>
-        <w:rPr>
-          <w:rFonts w:ascii="Times New Roman" w:hAnsi="Times New Roman" w:cs="Times New Roman"/>
-          <w:sz w:val="32"/>
-          <w:szCs w:val="32"/>
-        </w:rPr>
-        <w:t>0;.</w:t>
-      </w:r>
-      <w:proofErr w:type="gramEnd"/>
-      <w:r>
-        <w:rPr>
-          <w:rFonts w:ascii="Times New Roman" w:hAnsi="Times New Roman" w:cs="Times New Roman"/>
-          <w:sz w:val="32"/>
-          <w:szCs w:val="32"/>
-        </w:rPr>
-        <w:t xml:space="preserve"> Use one loop to read five integers into the array and a second loop to add them to total. Display the total. Assume the user enters exactly five valid integers whose sum fits in int</w:t>
+        <w:t>Declare int numbers[5]; and initialise int total = 0;. Use one loop to read five integers into the array and a second loop to add them to total. Display the total. Assume the user enters exactly five valid integers whose sum fits in int</w:t>
       </w:r>
       <w:r>
         <w:rPr>
@@ -446,16 +410,221 @@
         <w:jc w:val="center"/>
         <w:rPr>
           <w:rFonts w:ascii="Times New Roman" w:hAnsi="Times New Roman" w:cs="Times New Roman"/>
-          <w:sz w:val="44"/>
-          <w:szCs w:val="44"/>
+          <w:sz w:val="32"/>
+          <w:szCs w:val="32"/>
         </w:rPr>
       </w:pPr>
       <w:r>
         <w:rPr>
           <w:rFonts w:ascii="Times New Roman" w:hAnsi="Times New Roman" w:cs="Times New Roman"/>
-          <w:sz w:val="44"/>
-          <w:szCs w:val="44"/>
-        </w:rPr>
+          <w:sz w:val="32"/>
+          <w:szCs w:val="32"/>
+        </w:rPr>
+        <w:drawing>
+          <wp:inline distT="0" distB="0" distL="0" distR="0" wp14:anchorId="2DBAE4A5" wp14:editId="7E971348">
+            <wp:extent cx="5953123" cy="793750"/>
+            <wp:effectExtent l="0" t="0" r="0" b="6350"/>
+            <wp:docPr id="1996834324" name="Picture 1"/>
+            <wp:cNvGraphicFramePr>
+              <a:graphicFrameLocks xmlns:a="http://schemas.openxmlformats.org/drawingml/2006/main" noChangeAspect="1"/>
+            </wp:cNvGraphicFramePr>
+            <a:graphic xmlns:a="http://schemas.openxmlformats.org/drawingml/2006/main">
+              <a:graphicData uri="http://schemas.openxmlformats.org/drawingml/2006/picture">
+                <pic:pic xmlns:pic="http://schemas.openxmlformats.org/drawingml/2006/picture">
+                  <pic:nvPicPr>
+                    <pic:cNvPr id="1996834324" name=""/>
+                    <pic:cNvPicPr/>
+                  </pic:nvPicPr>
+                  <pic:blipFill>
+                    <a:blip r:embed="rId8"/>
+                    <a:stretch>
+                      <a:fillRect/>
+                    </a:stretch>
+                  </pic:blipFill>
+                  <pic:spPr>
+                    <a:xfrm>
+                      <a:off x="0" y="0"/>
+                      <a:ext cx="5964918" cy="795323"/>
+                    </a:xfrm>
+                    <a:prstGeom prst="rect">
+                      <a:avLst/>
+                    </a:prstGeom>
+                  </pic:spPr>
+                </pic:pic>
+              </a:graphicData>
+            </a:graphic>
+          </wp:inline>
+        </w:drawing>
+      </w:r>
+    </w:p>
+    <w:p>
+      <w:pPr>
+        <w:jc w:val="center"/>
+        <w:rPr>
+          <w:rFonts w:ascii="Times New Roman" w:hAnsi="Times New Roman" w:cs="Times New Roman"/>
+          <w:sz w:val="32"/>
+          <w:szCs w:val="32"/>
+        </w:rPr>
+      </w:pPr>
+      <w:r>
+        <w:rPr>
+          <w:rFonts w:ascii="Times New Roman" w:hAnsi="Times New Roman" w:cs="Times New Roman"/>
+          <w:sz w:val="32"/>
+          <w:szCs w:val="32"/>
+        </w:rPr>
+        <w:drawing>
+          <wp:inline distT="0" distB="0" distL="0" distR="0" wp14:anchorId="56E62DA1" wp14:editId="773BF31D">
+            <wp:extent cx="5867400" cy="900289"/>
+            <wp:effectExtent l="0" t="0" r="0" b="0"/>
+            <wp:docPr id="811790705" name="Picture 1"/>
+            <wp:cNvGraphicFramePr>
+              <a:graphicFrameLocks xmlns:a="http://schemas.openxmlformats.org/drawingml/2006/main" noChangeAspect="1"/>
+            </wp:cNvGraphicFramePr>
+            <a:graphic xmlns:a="http://schemas.openxmlformats.org/drawingml/2006/main">
+              <a:graphicData uri="http://schemas.openxmlformats.org/drawingml/2006/picture">
+                <pic:pic xmlns:pic="http://schemas.openxmlformats.org/drawingml/2006/picture">
+                  <pic:nvPicPr>
+                    <pic:cNvPr id="811790705" name=""/>
+                    <pic:cNvPicPr/>
+                  </pic:nvPicPr>
+                  <pic:blipFill>
+                    <a:blip r:embed="rId9"/>
+                    <a:stretch>
+                      <a:fillRect/>
+                    </a:stretch>
+                  </pic:blipFill>
+                  <pic:spPr>
+                    <a:xfrm>
+                      <a:off x="0" y="0"/>
+                      <a:ext cx="5961645" cy="914750"/>
+                    </a:xfrm>
+                    <a:prstGeom prst="rect">
+                      <a:avLst/>
+                    </a:prstGeom>
+                  </pic:spPr>
+                </pic:pic>
+              </a:graphicData>
+            </a:graphic>
+          </wp:inline>
+        </w:drawing>
+      </w:r>
+    </w:p>
+    <w:p>
+      <w:pPr>
+        <w:jc w:val="center"/>
+        <w:rPr>
+          <w:rFonts w:ascii="Times New Roman" w:hAnsi="Times New Roman" w:cs="Times New Roman"/>
+          <w:sz w:val="44"/>
+          <w:szCs w:val="44"/>
+        </w:rPr>
+      </w:pPr>
+    </w:p>
+    <w:p>
+      <w:pPr>
+        <w:jc w:val="center"/>
+        <w:rPr>
+          <w:rFonts w:ascii="Times New Roman" w:hAnsi="Times New Roman" w:cs="Times New Roman"/>
+          <w:sz w:val="44"/>
+          <w:szCs w:val="44"/>
+        </w:rPr>
+      </w:pPr>
+    </w:p>
+    <w:p>
+      <w:pPr>
+        <w:jc w:val="center"/>
+        <w:rPr>
+          <w:rFonts w:ascii="Times New Roman" w:hAnsi="Times New Roman" w:cs="Times New Roman"/>
+          <w:sz w:val="44"/>
+          <w:szCs w:val="44"/>
+        </w:rPr>
+      </w:pPr>
+    </w:p>
+    <w:p>
+      <w:pPr>
+        <w:jc w:val="center"/>
+        <w:rPr>
+          <w:rFonts w:ascii="Times New Roman" w:hAnsi="Times New Roman" w:cs="Times New Roman"/>
+          <w:sz w:val="44"/>
+          <w:szCs w:val="44"/>
+        </w:rPr>
+      </w:pPr>
+    </w:p>
+    <w:p>
+      <w:pPr>
+        <w:jc w:val="center"/>
+        <w:rPr>
+          <w:rFonts w:ascii="Times New Roman" w:hAnsi="Times New Roman" w:cs="Times New Roman"/>
+          <w:sz w:val="44"/>
+          <w:szCs w:val="44"/>
+        </w:rPr>
+      </w:pPr>
+    </w:p>
+    <w:p>
+      <w:pPr>
+        <w:jc w:val="center"/>
+        <w:rPr>
+          <w:rFonts w:ascii="Times New Roman" w:hAnsi="Times New Roman" w:cs="Times New Roman"/>
+          <w:sz w:val="44"/>
+          <w:szCs w:val="44"/>
+        </w:rPr>
+      </w:pPr>
+    </w:p>
+    <w:p>
+      <w:pPr>
+        <w:jc w:val="center"/>
+        <w:rPr>
+          <w:rFonts w:ascii="Times New Roman" w:hAnsi="Times New Roman" w:cs="Times New Roman"/>
+          <w:sz w:val="44"/>
+          <w:szCs w:val="44"/>
+        </w:rPr>
+      </w:pPr>
+    </w:p>
+    <w:p>
+      <w:pPr>
+        <w:jc w:val="center"/>
+        <w:rPr>
+          <w:rFonts w:ascii="Times New Roman" w:hAnsi="Times New Roman" w:cs="Times New Roman"/>
+          <w:sz w:val="44"/>
+          <w:szCs w:val="44"/>
+        </w:rPr>
+      </w:pPr>
+    </w:p>
+    <w:p>
+      <w:pPr>
+        <w:jc w:val="center"/>
+        <w:rPr>
+          <w:rFonts w:ascii="Times New Roman" w:hAnsi="Times New Roman" w:cs="Times New Roman"/>
+          <w:sz w:val="44"/>
+          <w:szCs w:val="44"/>
+        </w:rPr>
+      </w:pPr>
+    </w:p>
+    <w:p>
+      <w:pPr>
+        <w:jc w:val="center"/>
+        <w:rPr>
+          <w:rFonts w:ascii="Times New Roman" w:hAnsi="Times New Roman" w:cs="Times New Roman"/>
+          <w:sz w:val="44"/>
+          <w:szCs w:val="44"/>
+        </w:rPr>
+      </w:pPr>
+    </w:p>
+    <w:p>
+      <w:pPr>
+        <w:jc w:val="center"/>
+        <w:rPr>
+          <w:rFonts w:ascii="Times New Roman" w:hAnsi="Times New Roman" w:cs="Times New Roman"/>
+          <w:sz w:val="44"/>
+          <w:szCs w:val="44"/>
+        </w:rPr>
+      </w:pPr>
+      <w:r>
+        <w:rPr>
+          <w:rFonts w:ascii="Times New Roman" w:hAnsi="Times New Roman" w:cs="Times New Roman"/>
+          <w:sz w:val="44"/>
+          <w:szCs w:val="44"/>
+        </w:rPr>
+        <w:lastRenderedPageBreak/>
         <w:t>Task: 3</w:t>
       </w:r>
     </w:p>
@@ -468,6 +637,207 @@
           <w:szCs w:val="44"/>
         </w:rPr>
       </w:pPr>
+      <w:r>
+        <w:rPr>
+          <w:rFonts w:ascii="Times New Roman" w:hAnsi="Times New Roman" w:cs="Times New Roman"/>
+          <w:sz w:val="44"/>
+          <w:szCs w:val="44"/>
+        </w:rPr>
+        <w:drawing>
+          <wp:inline distT="0" distB="0" distL="0" distR="0" wp14:anchorId="72BB2E0D" wp14:editId="11E2AED9">
+            <wp:extent cx="5867702" cy="7398130"/>
+            <wp:effectExtent l="0" t="0" r="0" b="0"/>
+            <wp:docPr id="2064133748" name="Picture 1"/>
+            <wp:cNvGraphicFramePr>
+              <a:graphicFrameLocks xmlns:a="http://schemas.openxmlformats.org/drawingml/2006/main" noChangeAspect="1"/>
+            </wp:cNvGraphicFramePr>
+            <a:graphic xmlns:a="http://schemas.openxmlformats.org/drawingml/2006/main">
+              <a:graphicData uri="http://schemas.openxmlformats.org/drawingml/2006/picture">
+                <pic:pic xmlns:pic="http://schemas.openxmlformats.org/drawingml/2006/picture">
+                  <pic:nvPicPr>
+                    <pic:cNvPr id="2064133748" name=""/>
+                    <pic:cNvPicPr/>
+                  </pic:nvPicPr>
+                  <pic:blipFill>
+                    <a:blip r:embed="rId10"/>
+                    <a:stretch>
+                      <a:fillRect/>
+                    </a:stretch>
+                  </pic:blipFill>
+                  <pic:spPr>
+                    <a:xfrm>
+                      <a:off x="0" y="0"/>
+                      <a:ext cx="5867702" cy="7398130"/>
+                    </a:xfrm>
+                    <a:prstGeom prst="rect">
+                      <a:avLst/>
+                    </a:prstGeom>
+                  </pic:spPr>
+                </pic:pic>
+              </a:graphicData>
+            </a:graphic>
+          </wp:inline>
+        </w:drawing>
+      </w:r>
+    </w:p>
+    <w:p>
+      <w:pPr>
+        <w:jc w:val="center"/>
+        <w:rPr>
+          <w:rFonts w:ascii="Times New Roman" w:hAnsi="Times New Roman" w:cs="Times New Roman"/>
+          <w:sz w:val="44"/>
+          <w:szCs w:val="44"/>
+        </w:rPr>
+      </w:pPr>
+      <w:r>
+        <w:rPr>
+          <w:rFonts w:ascii="Times New Roman" w:hAnsi="Times New Roman" w:cs="Times New Roman"/>
+          <w:sz w:val="44"/>
+          <w:szCs w:val="44"/>
+        </w:rPr>
+        <w:drawing>
+          <wp:inline distT="0" distB="0" distL="0" distR="0" wp14:anchorId="6F37B880" wp14:editId="46B22C62">
+            <wp:extent cx="3245716" cy="2476500"/>
+            <wp:effectExtent l="0" t="0" r="0" b="0"/>
+            <wp:docPr id="1394269931" name="Picture 1"/>
+            <wp:cNvGraphicFramePr>
+              <a:graphicFrameLocks xmlns:a="http://schemas.openxmlformats.org/drawingml/2006/main" noChangeAspect="1"/>
+            </wp:cNvGraphicFramePr>
+            <a:graphic xmlns:a="http://schemas.openxmlformats.org/drawingml/2006/main">
+              <a:graphicData uri="http://schemas.openxmlformats.org/drawingml/2006/picture">
+                <pic:pic xmlns:pic="http://schemas.openxmlformats.org/drawingml/2006/picture">
+                  <pic:nvPicPr>
+                    <pic:cNvPr id="1394269931" name=""/>
+                    <pic:cNvPicPr/>
+                  </pic:nvPicPr>
+                  <pic:blipFill>
+                    <a:blip r:embed="rId11"/>
+                    <a:stretch>
+                      <a:fillRect/>
+                    </a:stretch>
+                  </pic:blipFill>
+                  <pic:spPr>
+                    <a:xfrm>
+                      <a:off x="0" y="0"/>
+                      <a:ext cx="3251177" cy="2480667"/>
+                    </a:xfrm>
+                    <a:prstGeom prst="rect">
+                      <a:avLst/>
+                    </a:prstGeom>
+                  </pic:spPr>
+                </pic:pic>
+              </a:graphicData>
+            </a:graphic>
+          </wp:inline>
+        </w:drawing>
+      </w:r>
+    </w:p>
+    <w:p>
+      <w:pPr>
+        <w:jc w:val="center"/>
+        <w:rPr>
+          <w:rFonts w:ascii="Times New Roman" w:hAnsi="Times New Roman" w:cs="Times New Roman"/>
+          <w:sz w:val="32"/>
+          <w:szCs w:val="32"/>
+        </w:rPr>
+      </w:pPr>
+      <w:r>
+        <w:rPr>
+          <w:rFonts w:ascii="Times New Roman" w:hAnsi="Times New Roman" w:cs="Times New Roman"/>
+          <w:sz w:val="32"/>
+          <w:szCs w:val="32"/>
+        </w:rPr>
+        <w:t>Since we only changed student 1’s marks so student 2’s marks are not changed.</w:t>
+      </w:r>
+    </w:p>
+    <w:p>
+      <w:pPr>
+        <w:jc w:val="center"/>
+        <w:rPr>
+          <w:rFonts w:ascii="Times New Roman" w:hAnsi="Times New Roman" w:cs="Times New Roman"/>
+          <w:sz w:val="32"/>
+          <w:szCs w:val="32"/>
+        </w:rPr>
+      </w:pPr>
+    </w:p>
+    <w:p>
+      <w:pPr>
+        <w:jc w:val="center"/>
+        <w:rPr>
+          <w:rFonts w:ascii="Times New Roman" w:hAnsi="Times New Roman" w:cs="Times New Roman"/>
+          <w:sz w:val="32"/>
+          <w:szCs w:val="32"/>
+        </w:rPr>
+      </w:pPr>
+    </w:p>
+    <w:p>
+      <w:pPr>
+        <w:jc w:val="center"/>
+        <w:rPr>
+          <w:rFonts w:ascii="Times New Roman" w:hAnsi="Times New Roman" w:cs="Times New Roman"/>
+          <w:sz w:val="32"/>
+          <w:szCs w:val="32"/>
+        </w:rPr>
+      </w:pPr>
+    </w:p>
+    <w:p>
+      <w:pPr>
+        <w:jc w:val="center"/>
+        <w:rPr>
+          <w:rFonts w:ascii="Times New Roman" w:hAnsi="Times New Roman" w:cs="Times New Roman"/>
+          <w:sz w:val="32"/>
+          <w:szCs w:val="32"/>
+        </w:rPr>
+      </w:pPr>
+    </w:p>
+    <w:p>
+      <w:pPr>
+        <w:jc w:val="center"/>
+        <w:rPr>
+          <w:rFonts w:ascii="Times New Roman" w:hAnsi="Times New Roman" w:cs="Times New Roman"/>
+          <w:sz w:val="32"/>
+          <w:szCs w:val="32"/>
+        </w:rPr>
+      </w:pPr>
+    </w:p>
+    <w:p>
+      <w:pPr>
+        <w:jc w:val="center"/>
+        <w:rPr>
+          <w:rFonts w:ascii="Times New Roman" w:hAnsi="Times New Roman" w:cs="Times New Roman"/>
+          <w:sz w:val="32"/>
+          <w:szCs w:val="32"/>
+        </w:rPr>
+      </w:pPr>
+    </w:p>
+    <w:p>
+      <w:pPr>
+        <w:jc w:val="center"/>
+        <w:rPr>
+          <w:rFonts w:ascii="Times New Roman" w:hAnsi="Times New Roman" w:cs="Times New Roman"/>
+          <w:sz w:val="32"/>
+          <w:szCs w:val="32"/>
+        </w:rPr>
+      </w:pPr>
+    </w:p>
+    <w:p>
+      <w:pPr>
+        <w:jc w:val="center"/>
+        <w:rPr>
+          <w:rFonts w:ascii="Times New Roman" w:hAnsi="Times New Roman" w:cs="Times New Roman"/>
+          <w:sz w:val="44"/>
+          <w:szCs w:val="44"/>
+        </w:rPr>
+      </w:pPr>
+      <w:r>
+        <w:rPr>
+          <w:rFonts w:ascii="Times New Roman" w:hAnsi="Times New Roman" w:cs="Times New Roman"/>
+          <w:sz w:val="44"/>
+          <w:szCs w:val="44"/>
+        </w:rPr>
+        <w:lastRenderedPageBreak/>
+        <w:t>Task: 4</w:t>
+      </w:r>
     </w:p>
     <w:sectPr>
       <w:pgSz w:w="15840" w:h="24480" w:code="3"/>

</xml_diff>

<commit_message>
Lab 01 Task: 04
</commit_message>
<xml_diff>
--- a/Labs/Lab 1/lab 01 answer doc.docx
+++ b/Labs/Lab 1/lab 01 answer doc.docx
@@ -838,6 +838,269 @@
         <w:lastRenderedPageBreak/>
         <w:t>Task: 4</w:t>
       </w:r>
+    </w:p>
+    <w:p>
+      <w:pPr>
+        <w:jc w:val="center"/>
+        <w:rPr>
+          <w:rFonts w:ascii="Times New Roman" w:hAnsi="Times New Roman" w:cs="Times New Roman"/>
+          <w:sz w:val="32"/>
+          <w:szCs w:val="32"/>
+        </w:rPr>
+      </w:pPr>
+      <w:r>
+        <w:rPr>
+          <w:rFonts w:ascii="Times New Roman" w:hAnsi="Times New Roman" w:cs="Times New Roman"/>
+          <w:sz w:val="32"/>
+          <w:szCs w:val="32"/>
+        </w:rPr>
+        <w:t>Read 8 integers into an array. Find and display the largest and smallest values and their indices. If a value occurs more than once, report its first occurrence.</w:t>
+      </w:r>
+    </w:p>
+    <w:p>
+      <w:pPr>
+        <w:jc w:val="center"/>
+        <w:rPr>
+          <w:rFonts w:ascii="Times New Roman" w:hAnsi="Times New Roman" w:cs="Times New Roman"/>
+          <w:sz w:val="32"/>
+          <w:szCs w:val="32"/>
+        </w:rPr>
+      </w:pPr>
+    </w:p>
+    <w:p>
+      <w:pPr>
+        <w:jc w:val="center"/>
+        <w:rPr>
+          <w:rFonts w:ascii="Times New Roman" w:hAnsi="Times New Roman" w:cs="Times New Roman"/>
+          <w:sz w:val="44"/>
+          <w:szCs w:val="44"/>
+        </w:rPr>
+      </w:pPr>
+      <w:r>
+        <w:rPr>
+          <w:rFonts w:ascii="Times New Roman" w:hAnsi="Times New Roman" w:cs="Times New Roman"/>
+          <w:sz w:val="44"/>
+          <w:szCs w:val="44"/>
+        </w:rPr>
+        <w:drawing>
+          <wp:inline distT="0" distB="0" distL="0" distR="0" wp14:anchorId="1353CFC6" wp14:editId="115691F6">
+            <wp:extent cx="8096666" cy="8484036"/>
+            <wp:effectExtent l="0" t="0" r="0" b="0"/>
+            <wp:docPr id="1774208165" name="Picture 1"/>
+            <wp:cNvGraphicFramePr>
+              <a:graphicFrameLocks xmlns:a="http://schemas.openxmlformats.org/drawingml/2006/main" noChangeAspect="1"/>
+            </wp:cNvGraphicFramePr>
+            <a:graphic xmlns:a="http://schemas.openxmlformats.org/drawingml/2006/main">
+              <a:graphicData uri="http://schemas.openxmlformats.org/drawingml/2006/picture">
+                <pic:pic xmlns:pic="http://schemas.openxmlformats.org/drawingml/2006/picture">
+                  <pic:nvPicPr>
+                    <pic:cNvPr id="1774208165" name=""/>
+                    <pic:cNvPicPr/>
+                  </pic:nvPicPr>
+                  <pic:blipFill>
+                    <a:blip r:embed="rId12"/>
+                    <a:stretch>
+                      <a:fillRect/>
+                    </a:stretch>
+                  </pic:blipFill>
+                  <pic:spPr>
+                    <a:xfrm>
+                      <a:off x="0" y="0"/>
+                      <a:ext cx="8096666" cy="8484036"/>
+                    </a:xfrm>
+                    <a:prstGeom prst="rect">
+                      <a:avLst/>
+                    </a:prstGeom>
+                  </pic:spPr>
+                </pic:pic>
+              </a:graphicData>
+            </a:graphic>
+          </wp:inline>
+        </w:drawing>
+      </w:r>
+    </w:p>
+    <w:p>
+      <w:pPr>
+        <w:jc w:val="center"/>
+        <w:rPr>
+          <w:rFonts w:ascii="Times New Roman" w:hAnsi="Times New Roman" w:cs="Times New Roman"/>
+          <w:sz w:val="44"/>
+          <w:szCs w:val="44"/>
+        </w:rPr>
+      </w:pPr>
+      <w:r>
+        <w:rPr>
+          <w:rFonts w:ascii="Times New Roman" w:hAnsi="Times New Roman" w:cs="Times New Roman"/>
+          <w:sz w:val="44"/>
+          <w:szCs w:val="44"/>
+        </w:rPr>
+        <w:drawing>
+          <wp:inline distT="0" distB="0" distL="0" distR="0" wp14:anchorId="27E2A9C8" wp14:editId="3D982FEE">
+            <wp:extent cx="4292821" cy="654084"/>
+            <wp:effectExtent l="0" t="0" r="0" b="0"/>
+            <wp:docPr id="702681795" name="Picture 1"/>
+            <wp:cNvGraphicFramePr>
+              <a:graphicFrameLocks xmlns:a="http://schemas.openxmlformats.org/drawingml/2006/main" noChangeAspect="1"/>
+            </wp:cNvGraphicFramePr>
+            <a:graphic xmlns:a="http://schemas.openxmlformats.org/drawingml/2006/main">
+              <a:graphicData uri="http://schemas.openxmlformats.org/drawingml/2006/picture">
+                <pic:pic xmlns:pic="http://schemas.openxmlformats.org/drawingml/2006/picture">
+                  <pic:nvPicPr>
+                    <pic:cNvPr id="702681795" name=""/>
+                    <pic:cNvPicPr/>
+                  </pic:nvPicPr>
+                  <pic:blipFill>
+                    <a:blip r:embed="rId13"/>
+                    <a:stretch>
+                      <a:fillRect/>
+                    </a:stretch>
+                  </pic:blipFill>
+                  <pic:spPr>
+                    <a:xfrm>
+                      <a:off x="0" y="0"/>
+                      <a:ext cx="4292821" cy="654084"/>
+                    </a:xfrm>
+                    <a:prstGeom prst="rect">
+                      <a:avLst/>
+                    </a:prstGeom>
+                  </pic:spPr>
+                </pic:pic>
+              </a:graphicData>
+            </a:graphic>
+          </wp:inline>
+        </w:drawing>
+      </w:r>
+    </w:p>
+    <w:p>
+      <w:pPr>
+        <w:jc w:val="center"/>
+        <w:rPr>
+          <w:rFonts w:ascii="Times New Roman" w:hAnsi="Times New Roman" w:cs="Times New Roman"/>
+          <w:sz w:val="44"/>
+          <w:szCs w:val="44"/>
+        </w:rPr>
+      </w:pPr>
+      <w:r>
+        <w:rPr>
+          <w:rFonts w:ascii="Times New Roman" w:hAnsi="Times New Roman" w:cs="Times New Roman"/>
+          <w:sz w:val="44"/>
+          <w:szCs w:val="44"/>
+        </w:rPr>
+        <w:drawing>
+          <wp:inline distT="0" distB="0" distL="0" distR="0" wp14:anchorId="5CFA3D76" wp14:editId="0714AD97">
+            <wp:extent cx="4483330" cy="673135"/>
+            <wp:effectExtent l="0" t="0" r="0" b="0"/>
+            <wp:docPr id="1795585640" name="Picture 1"/>
+            <wp:cNvGraphicFramePr>
+              <a:graphicFrameLocks xmlns:a="http://schemas.openxmlformats.org/drawingml/2006/main" noChangeAspect="1"/>
+            </wp:cNvGraphicFramePr>
+            <a:graphic xmlns:a="http://schemas.openxmlformats.org/drawingml/2006/main">
+              <a:graphicData uri="http://schemas.openxmlformats.org/drawingml/2006/picture">
+                <pic:pic xmlns:pic="http://schemas.openxmlformats.org/drawingml/2006/picture">
+                  <pic:nvPicPr>
+                    <pic:cNvPr id="1795585640" name=""/>
+                    <pic:cNvPicPr/>
+                  </pic:nvPicPr>
+                  <pic:blipFill>
+                    <a:blip r:embed="rId14"/>
+                    <a:stretch>
+                      <a:fillRect/>
+                    </a:stretch>
+                  </pic:blipFill>
+                  <pic:spPr>
+                    <a:xfrm>
+                      <a:off x="0" y="0"/>
+                      <a:ext cx="4483330" cy="673135"/>
+                    </a:xfrm>
+                    <a:prstGeom prst="rect">
+                      <a:avLst/>
+                    </a:prstGeom>
+                  </pic:spPr>
+                </pic:pic>
+              </a:graphicData>
+            </a:graphic>
+          </wp:inline>
+        </w:drawing>
+      </w:r>
+    </w:p>
+    <w:p>
+      <w:pPr>
+        <w:jc w:val="center"/>
+        <w:rPr>
+          <w:rFonts w:ascii="Times New Roman" w:hAnsi="Times New Roman" w:cs="Times New Roman"/>
+          <w:sz w:val="44"/>
+          <w:szCs w:val="44"/>
+        </w:rPr>
+      </w:pPr>
+    </w:p>
+    <w:p>
+      <w:pPr>
+        <w:jc w:val="center"/>
+        <w:rPr>
+          <w:rFonts w:ascii="Times New Roman" w:hAnsi="Times New Roman" w:cs="Times New Roman"/>
+          <w:sz w:val="44"/>
+          <w:szCs w:val="44"/>
+        </w:rPr>
+      </w:pPr>
+    </w:p>
+    <w:p>
+      <w:pPr>
+        <w:jc w:val="center"/>
+        <w:rPr>
+          <w:rFonts w:ascii="Times New Roman" w:hAnsi="Times New Roman" w:cs="Times New Roman"/>
+          <w:sz w:val="44"/>
+          <w:szCs w:val="44"/>
+        </w:rPr>
+      </w:pPr>
+    </w:p>
+    <w:p>
+      <w:pPr>
+        <w:jc w:val="center"/>
+        <w:rPr>
+          <w:rFonts w:ascii="Times New Roman" w:hAnsi="Times New Roman" w:cs="Times New Roman"/>
+          <w:sz w:val="44"/>
+          <w:szCs w:val="44"/>
+        </w:rPr>
+      </w:pPr>
+    </w:p>
+    <w:p>
+      <w:pPr>
+        <w:jc w:val="center"/>
+        <w:rPr>
+          <w:rFonts w:ascii="Times New Roman" w:hAnsi="Times New Roman" w:cs="Times New Roman"/>
+          <w:sz w:val="44"/>
+          <w:szCs w:val="44"/>
+        </w:rPr>
+      </w:pPr>
+      <w:r>
+        <w:rPr>
+          <w:rFonts w:ascii="Times New Roman" w:hAnsi="Times New Roman" w:cs="Times New Roman"/>
+          <w:sz w:val="44"/>
+          <w:szCs w:val="44"/>
+        </w:rPr>
+        <w:lastRenderedPageBreak/>
+        <w:t>Task: 5</w:t>
+      </w:r>
+    </w:p>
+    <w:p>
+      <w:pPr>
+        <w:jc w:val="center"/>
+        <w:rPr>
+          <w:rFonts w:ascii="Times New Roman" w:hAnsi="Times New Roman" w:cs="Times New Roman"/>
+          <w:sz w:val="44"/>
+          <w:szCs w:val="44"/>
+        </w:rPr>
+      </w:pPr>
+    </w:p>
+    <w:p>
+      <w:pPr>
+        <w:jc w:val="center"/>
+        <w:rPr>
+          <w:rFonts w:ascii="Times New Roman" w:hAnsi="Times New Roman" w:cs="Times New Roman"/>
+          <w:sz w:val="44"/>
+          <w:szCs w:val="44"/>
+        </w:rPr>
+      </w:pPr>
     </w:p>
     <w:sectPr>
       <w:pgSz w:w="15840" w:h="24480" w:code="3"/>

</xml_diff>

<commit_message>
Lab 01 Task: 05
</commit_message>
<xml_diff>
--- a/Labs/Lab 1/lab 01 answer doc.docx
+++ b/Labs/Lab 1/lab 01 answer doc.docx
@@ -1087,20 +1087,186 @@
         <w:jc w:val="center"/>
         <w:rPr>
           <w:rFonts w:ascii="Times New Roman" w:hAnsi="Times New Roman" w:cs="Times New Roman"/>
-          <w:sz w:val="44"/>
-          <w:szCs w:val="44"/>
-        </w:rPr>
-      </w:pPr>
-    </w:p>
-    <w:p>
-      <w:pPr>
-        <w:jc w:val="center"/>
-        <w:rPr>
-          <w:rFonts w:ascii="Times New Roman" w:hAnsi="Times New Roman" w:cs="Times New Roman"/>
-          <w:sz w:val="44"/>
-          <w:szCs w:val="44"/>
-        </w:rPr>
-      </w:pPr>
+          <w:sz w:val="32"/>
+          <w:szCs w:val="32"/>
+          <w:lang w:val="en"/>
+        </w:rPr>
+      </w:pPr>
+      <w:r>
+        <w:rPr>
+          <w:rFonts w:ascii="Times New Roman" w:hAnsi="Times New Roman" w:cs="Times New Roman"/>
+          <w:sz w:val="32"/>
+          <w:szCs w:val="32"/>
+          <w:lang w:val="en"/>
+        </w:rPr>
+        <w:t>Read 8 integers into an array. Find and display the largest and smallest values and their indices. If a value occurs more than once, report its first occurrence.</w:t>
+      </w:r>
+    </w:p>
+    <w:p>
+      <w:pPr>
+        <w:jc w:val="center"/>
+        <w:rPr>
+          <w:rFonts w:ascii="Times New Roman" w:hAnsi="Times New Roman" w:cs="Times New Roman"/>
+          <w:sz w:val="32"/>
+          <w:szCs w:val="32"/>
+        </w:rPr>
+      </w:pPr>
+    </w:p>
+    <w:p>
+      <w:pPr>
+        <w:jc w:val="center"/>
+        <w:rPr>
+          <w:rFonts w:ascii="Times New Roman" w:hAnsi="Times New Roman" w:cs="Times New Roman"/>
+          <w:sz w:val="44"/>
+          <w:szCs w:val="44"/>
+        </w:rPr>
+      </w:pPr>
+      <w:r>
+        <w:rPr>
+          <w:rFonts w:ascii="Times New Roman" w:hAnsi="Times New Roman" w:cs="Times New Roman"/>
+          <w:sz w:val="44"/>
+          <w:szCs w:val="44"/>
+        </w:rPr>
+        <w:drawing>
+          <wp:inline distT="0" distB="0" distL="0" distR="0" wp14:anchorId="625A5FC7" wp14:editId="401950B3">
+            <wp:extent cx="8096666" cy="8484036"/>
+            <wp:effectExtent l="0" t="0" r="0" b="0"/>
+            <wp:docPr id="1913559857" name="Picture 1"/>
+            <wp:cNvGraphicFramePr>
+              <a:graphicFrameLocks xmlns:a="http://schemas.openxmlformats.org/drawingml/2006/main" noChangeAspect="1"/>
+            </wp:cNvGraphicFramePr>
+            <a:graphic xmlns:a="http://schemas.openxmlformats.org/drawingml/2006/main">
+              <a:graphicData uri="http://schemas.openxmlformats.org/drawingml/2006/picture">
+                <pic:pic xmlns:pic="http://schemas.openxmlformats.org/drawingml/2006/picture">
+                  <pic:nvPicPr>
+                    <pic:cNvPr id="1774208165" name=""/>
+                    <pic:cNvPicPr/>
+                  </pic:nvPicPr>
+                  <pic:blipFill>
+                    <a:blip r:embed="rId12"/>
+                    <a:stretch>
+                      <a:fillRect/>
+                    </a:stretch>
+                  </pic:blipFill>
+                  <pic:spPr>
+                    <a:xfrm>
+                      <a:off x="0" y="0"/>
+                      <a:ext cx="8096666" cy="8484036"/>
+                    </a:xfrm>
+                    <a:prstGeom prst="rect">
+                      <a:avLst/>
+                    </a:prstGeom>
+                  </pic:spPr>
+                </pic:pic>
+              </a:graphicData>
+            </a:graphic>
+          </wp:inline>
+        </w:drawing>
+      </w:r>
+    </w:p>
+    <w:p>
+      <w:pPr>
+        <w:jc w:val="center"/>
+        <w:rPr>
+          <w:rFonts w:ascii="Times New Roman" w:hAnsi="Times New Roman" w:cs="Times New Roman"/>
+          <w:sz w:val="44"/>
+          <w:szCs w:val="44"/>
+        </w:rPr>
+      </w:pPr>
+      <w:r>
+        <w:rPr>
+          <w:rFonts w:ascii="Times New Roman" w:hAnsi="Times New Roman" w:cs="Times New Roman"/>
+          <w:sz w:val="44"/>
+          <w:szCs w:val="44"/>
+        </w:rPr>
+        <w:drawing>
+          <wp:inline distT="0" distB="0" distL="0" distR="0" wp14:anchorId="604B83B1" wp14:editId="4C0806B9">
+            <wp:extent cx="4292821" cy="654084"/>
+            <wp:effectExtent l="0" t="0" r="0" b="0"/>
+            <wp:docPr id="563017560" name="Picture 1"/>
+            <wp:cNvGraphicFramePr>
+              <a:graphicFrameLocks xmlns:a="http://schemas.openxmlformats.org/drawingml/2006/main" noChangeAspect="1"/>
+            </wp:cNvGraphicFramePr>
+            <a:graphic xmlns:a="http://schemas.openxmlformats.org/drawingml/2006/main">
+              <a:graphicData uri="http://schemas.openxmlformats.org/drawingml/2006/picture">
+                <pic:pic xmlns:pic="http://schemas.openxmlformats.org/drawingml/2006/picture">
+                  <pic:nvPicPr>
+                    <pic:cNvPr id="702681795" name=""/>
+                    <pic:cNvPicPr/>
+                  </pic:nvPicPr>
+                  <pic:blipFill>
+                    <a:blip r:embed="rId13"/>
+                    <a:stretch>
+                      <a:fillRect/>
+                    </a:stretch>
+                  </pic:blipFill>
+                  <pic:spPr>
+                    <a:xfrm>
+                      <a:off x="0" y="0"/>
+                      <a:ext cx="4292821" cy="654084"/>
+                    </a:xfrm>
+                    <a:prstGeom prst="rect">
+                      <a:avLst/>
+                    </a:prstGeom>
+                  </pic:spPr>
+                </pic:pic>
+              </a:graphicData>
+            </a:graphic>
+          </wp:inline>
+        </w:drawing>
+      </w:r>
+    </w:p>
+    <w:p>
+      <w:pPr>
+        <w:jc w:val="center"/>
+        <w:rPr>
+          <w:rFonts w:ascii="Times New Roman" w:hAnsi="Times New Roman" w:cs="Times New Roman"/>
+          <w:sz w:val="44"/>
+          <w:szCs w:val="44"/>
+        </w:rPr>
+      </w:pPr>
+      <w:r>
+        <w:rPr>
+          <w:rFonts w:ascii="Times New Roman" w:hAnsi="Times New Roman" w:cs="Times New Roman"/>
+          <w:sz w:val="44"/>
+          <w:szCs w:val="44"/>
+        </w:rPr>
+        <w:drawing>
+          <wp:inline distT="0" distB="0" distL="0" distR="0" wp14:anchorId="20446B2A" wp14:editId="7BCFF46F">
+            <wp:extent cx="4483330" cy="673135"/>
+            <wp:effectExtent l="0" t="0" r="0" b="0"/>
+            <wp:docPr id="890235667" name="Picture 1"/>
+            <wp:cNvGraphicFramePr>
+              <a:graphicFrameLocks xmlns:a="http://schemas.openxmlformats.org/drawingml/2006/main" noChangeAspect="1"/>
+            </wp:cNvGraphicFramePr>
+            <a:graphic xmlns:a="http://schemas.openxmlformats.org/drawingml/2006/main">
+              <a:graphicData uri="http://schemas.openxmlformats.org/drawingml/2006/picture">
+                <pic:pic xmlns:pic="http://schemas.openxmlformats.org/drawingml/2006/picture">
+                  <pic:nvPicPr>
+                    <pic:cNvPr id="1795585640" name=""/>
+                    <pic:cNvPicPr/>
+                  </pic:nvPicPr>
+                  <pic:blipFill>
+                    <a:blip r:embed="rId14"/>
+                    <a:stretch>
+                      <a:fillRect/>
+                    </a:stretch>
+                  </pic:blipFill>
+                  <pic:spPr>
+                    <a:xfrm>
+                      <a:off x="0" y="0"/>
+                      <a:ext cx="4483330" cy="673135"/>
+                    </a:xfrm>
+                    <a:prstGeom prst="rect">
+                      <a:avLst/>
+                    </a:prstGeom>
+                  </pic:spPr>
+                </pic:pic>
+              </a:graphicData>
+            </a:graphic>
+          </wp:inline>
+        </w:drawing>
+      </w:r>
     </w:p>
     <w:sectPr>
       <w:pgSz w:w="15840" w:h="24480" w:code="3"/>

</xml_diff>

<commit_message>
Lab 01 Task: 06
</commit_message>
<xml_diff>
--- a/Labs/Lab 1/lab 01 answer doc.docx
+++ b/Labs/Lab 1/lab 01 answer doc.docx
@@ -1266,6 +1266,350 @@
             </a:graphic>
           </wp:inline>
         </w:drawing>
+      </w:r>
+    </w:p>
+    <w:p>
+      <w:pPr>
+        <w:jc w:val="center"/>
+        <w:rPr>
+          <w:rFonts w:ascii="Times New Roman" w:hAnsi="Times New Roman" w:cs="Times New Roman"/>
+          <w:sz w:val="44"/>
+          <w:szCs w:val="44"/>
+        </w:rPr>
+      </w:pPr>
+    </w:p>
+    <w:p>
+      <w:pPr>
+        <w:jc w:val="center"/>
+        <w:rPr>
+          <w:rFonts w:ascii="Times New Roman" w:hAnsi="Times New Roman" w:cs="Times New Roman"/>
+          <w:sz w:val="44"/>
+          <w:szCs w:val="44"/>
+        </w:rPr>
+      </w:pPr>
+    </w:p>
+    <w:p>
+      <w:pPr>
+        <w:jc w:val="center"/>
+        <w:rPr>
+          <w:rFonts w:ascii="Times New Roman" w:hAnsi="Times New Roman" w:cs="Times New Roman"/>
+          <w:sz w:val="44"/>
+          <w:szCs w:val="44"/>
+        </w:rPr>
+      </w:pPr>
+    </w:p>
+    <w:p>
+      <w:pPr>
+        <w:jc w:val="center"/>
+        <w:rPr>
+          <w:rFonts w:ascii="Times New Roman" w:hAnsi="Times New Roman" w:cs="Times New Roman"/>
+          <w:sz w:val="44"/>
+          <w:szCs w:val="44"/>
+        </w:rPr>
+      </w:pPr>
+    </w:p>
+    <w:p>
+      <w:pPr>
+        <w:jc w:val="center"/>
+        <w:rPr>
+          <w:rFonts w:ascii="Times New Roman" w:hAnsi="Times New Roman" w:cs="Times New Roman"/>
+          <w:sz w:val="44"/>
+          <w:szCs w:val="44"/>
+        </w:rPr>
+      </w:pPr>
+      <w:r>
+        <w:rPr>
+          <w:rFonts w:ascii="Times New Roman" w:hAnsi="Times New Roman" w:cs="Times New Roman"/>
+          <w:sz w:val="44"/>
+          <w:szCs w:val="44"/>
+        </w:rPr>
+        <w:lastRenderedPageBreak/>
+        <w:t>Task: 6</w:t>
+      </w:r>
+    </w:p>
+    <w:p>
+      <w:pPr>
+        <w:jc w:val="center"/>
+        <w:rPr>
+          <w:rFonts w:ascii="Times New Roman" w:hAnsi="Times New Roman" w:cs="Times New Roman"/>
+          <w:sz w:val="32"/>
+          <w:szCs w:val="32"/>
+        </w:rPr>
+      </w:pPr>
+      <w:r>
+        <w:rPr>
+          <w:rFonts w:ascii="Times New Roman" w:hAnsi="Times New Roman" w:cs="Times New Roman"/>
+          <w:sz w:val="32"/>
+          <w:szCs w:val="32"/>
+        </w:rPr>
+        <w:drawing>
+          <wp:inline distT="0" distB="0" distL="0" distR="0" wp14:anchorId="0D14E50A" wp14:editId="75A37530">
+            <wp:extent cx="5524784" cy="7258423"/>
+            <wp:effectExtent l="0" t="0" r="0" b="0"/>
+            <wp:docPr id="1866972573" name="Picture 1"/>
+            <wp:cNvGraphicFramePr>
+              <a:graphicFrameLocks xmlns:a="http://schemas.openxmlformats.org/drawingml/2006/main" noChangeAspect="1"/>
+            </wp:cNvGraphicFramePr>
+            <a:graphic xmlns:a="http://schemas.openxmlformats.org/drawingml/2006/main">
+              <a:graphicData uri="http://schemas.openxmlformats.org/drawingml/2006/picture">
+                <pic:pic xmlns:pic="http://schemas.openxmlformats.org/drawingml/2006/picture">
+                  <pic:nvPicPr>
+                    <pic:cNvPr id="1866972573" name=""/>
+                    <pic:cNvPicPr/>
+                  </pic:nvPicPr>
+                  <pic:blipFill>
+                    <a:blip r:embed="rId15"/>
+                    <a:stretch>
+                      <a:fillRect/>
+                    </a:stretch>
+                  </pic:blipFill>
+                  <pic:spPr>
+                    <a:xfrm>
+                      <a:off x="0" y="0"/>
+                      <a:ext cx="5524784" cy="7258423"/>
+                    </a:xfrm>
+                    <a:prstGeom prst="rect">
+                      <a:avLst/>
+                    </a:prstGeom>
+                  </pic:spPr>
+                </pic:pic>
+              </a:graphicData>
+            </a:graphic>
+          </wp:inline>
+        </w:drawing>
+      </w:r>
+    </w:p>
+    <w:p>
+      <w:pPr>
+        <w:jc w:val="center"/>
+        <w:rPr>
+          <w:rFonts w:ascii="Times New Roman" w:hAnsi="Times New Roman" w:cs="Times New Roman"/>
+          <w:sz w:val="32"/>
+          <w:szCs w:val="32"/>
+        </w:rPr>
+      </w:pPr>
+      <w:r>
+        <w:rPr>
+          <w:rFonts w:ascii="Times New Roman" w:hAnsi="Times New Roman" w:cs="Times New Roman"/>
+          <w:sz w:val="32"/>
+          <w:szCs w:val="32"/>
+        </w:rPr>
+        <w:drawing>
+          <wp:inline distT="0" distB="0" distL="0" distR="0" wp14:anchorId="470F4F85" wp14:editId="316A7C0E">
+            <wp:extent cx="4076910" cy="673135"/>
+            <wp:effectExtent l="0" t="0" r="0" b="0"/>
+            <wp:docPr id="1180770367" name="Picture 1"/>
+            <wp:cNvGraphicFramePr>
+              <a:graphicFrameLocks xmlns:a="http://schemas.openxmlformats.org/drawingml/2006/main" noChangeAspect="1"/>
+            </wp:cNvGraphicFramePr>
+            <a:graphic xmlns:a="http://schemas.openxmlformats.org/drawingml/2006/main">
+              <a:graphicData uri="http://schemas.openxmlformats.org/drawingml/2006/picture">
+                <pic:pic xmlns:pic="http://schemas.openxmlformats.org/drawingml/2006/picture">
+                  <pic:nvPicPr>
+                    <pic:cNvPr id="1180770367" name=""/>
+                    <pic:cNvPicPr/>
+                  </pic:nvPicPr>
+                  <pic:blipFill>
+                    <a:blip r:embed="rId16"/>
+                    <a:stretch>
+                      <a:fillRect/>
+                    </a:stretch>
+                  </pic:blipFill>
+                  <pic:spPr>
+                    <a:xfrm>
+                      <a:off x="0" y="0"/>
+                      <a:ext cx="4076910" cy="673135"/>
+                    </a:xfrm>
+                    <a:prstGeom prst="rect">
+                      <a:avLst/>
+                    </a:prstGeom>
+                  </pic:spPr>
+                </pic:pic>
+              </a:graphicData>
+            </a:graphic>
+          </wp:inline>
+        </w:drawing>
+      </w:r>
+    </w:p>
+    <w:p>
+      <w:pPr>
+        <w:jc w:val="center"/>
+        <w:rPr>
+          <w:rFonts w:ascii="Times New Roman" w:hAnsi="Times New Roman" w:cs="Times New Roman"/>
+          <w:sz w:val="32"/>
+          <w:szCs w:val="32"/>
+        </w:rPr>
+      </w:pPr>
+      <w:r>
+        <w:rPr>
+          <w:rFonts w:ascii="Times New Roman" w:hAnsi="Times New Roman" w:cs="Times New Roman"/>
+          <w:sz w:val="32"/>
+          <w:szCs w:val="32"/>
+        </w:rPr>
+        <w:drawing>
+          <wp:inline distT="0" distB="0" distL="0" distR="0" wp14:anchorId="1930DB21" wp14:editId="02534A46">
+            <wp:extent cx="4343623" cy="673135"/>
+            <wp:effectExtent l="0" t="0" r="0" b="0"/>
+            <wp:docPr id="451021593" name="Picture 1"/>
+            <wp:cNvGraphicFramePr>
+              <a:graphicFrameLocks xmlns:a="http://schemas.openxmlformats.org/drawingml/2006/main" noChangeAspect="1"/>
+            </wp:cNvGraphicFramePr>
+            <a:graphic xmlns:a="http://schemas.openxmlformats.org/drawingml/2006/main">
+              <a:graphicData uri="http://schemas.openxmlformats.org/drawingml/2006/picture">
+                <pic:pic xmlns:pic="http://schemas.openxmlformats.org/drawingml/2006/picture">
+                  <pic:nvPicPr>
+                    <pic:cNvPr id="451021593" name=""/>
+                    <pic:cNvPicPr/>
+                  </pic:nvPicPr>
+                  <pic:blipFill>
+                    <a:blip r:embed="rId17"/>
+                    <a:stretch>
+                      <a:fillRect/>
+                    </a:stretch>
+                  </pic:blipFill>
+                  <pic:spPr>
+                    <a:xfrm>
+                      <a:off x="0" y="0"/>
+                      <a:ext cx="4343623" cy="673135"/>
+                    </a:xfrm>
+                    <a:prstGeom prst="rect">
+                      <a:avLst/>
+                    </a:prstGeom>
+                  </pic:spPr>
+                </pic:pic>
+              </a:graphicData>
+            </a:graphic>
+          </wp:inline>
+        </w:drawing>
+      </w:r>
+    </w:p>
+    <w:p>
+      <w:pPr>
+        <w:jc w:val="center"/>
+        <w:rPr>
+          <w:rFonts w:ascii="Times New Roman" w:hAnsi="Times New Roman" w:cs="Times New Roman"/>
+          <w:sz w:val="32"/>
+          <w:szCs w:val="32"/>
+        </w:rPr>
+      </w:pPr>
+    </w:p>
+    <w:p>
+      <w:pPr>
+        <w:jc w:val="center"/>
+        <w:rPr>
+          <w:rFonts w:ascii="Times New Roman" w:hAnsi="Times New Roman" w:cs="Times New Roman"/>
+          <w:sz w:val="32"/>
+          <w:szCs w:val="32"/>
+        </w:rPr>
+      </w:pPr>
+    </w:p>
+    <w:p>
+      <w:pPr>
+        <w:jc w:val="center"/>
+        <w:rPr>
+          <w:rFonts w:ascii="Times New Roman" w:hAnsi="Times New Roman" w:cs="Times New Roman"/>
+          <w:sz w:val="32"/>
+          <w:szCs w:val="32"/>
+        </w:rPr>
+      </w:pPr>
+    </w:p>
+    <w:p>
+      <w:pPr>
+        <w:jc w:val="center"/>
+        <w:rPr>
+          <w:rFonts w:ascii="Times New Roman" w:hAnsi="Times New Roman" w:cs="Times New Roman"/>
+          <w:sz w:val="32"/>
+          <w:szCs w:val="32"/>
+        </w:rPr>
+      </w:pPr>
+    </w:p>
+    <w:p>
+      <w:pPr>
+        <w:jc w:val="center"/>
+        <w:rPr>
+          <w:rFonts w:ascii="Times New Roman" w:hAnsi="Times New Roman" w:cs="Times New Roman"/>
+          <w:sz w:val="32"/>
+          <w:szCs w:val="32"/>
+        </w:rPr>
+      </w:pPr>
+    </w:p>
+    <w:p>
+      <w:pPr>
+        <w:jc w:val="center"/>
+        <w:rPr>
+          <w:rFonts w:ascii="Times New Roman" w:hAnsi="Times New Roman" w:cs="Times New Roman"/>
+          <w:sz w:val="32"/>
+          <w:szCs w:val="32"/>
+        </w:rPr>
+      </w:pPr>
+    </w:p>
+    <w:p>
+      <w:pPr>
+        <w:jc w:val="center"/>
+        <w:rPr>
+          <w:rFonts w:ascii="Times New Roman" w:hAnsi="Times New Roman" w:cs="Times New Roman"/>
+          <w:sz w:val="32"/>
+          <w:szCs w:val="32"/>
+        </w:rPr>
+      </w:pPr>
+    </w:p>
+    <w:p>
+      <w:pPr>
+        <w:jc w:val="center"/>
+        <w:rPr>
+          <w:rFonts w:ascii="Times New Roman" w:hAnsi="Times New Roman" w:cs="Times New Roman"/>
+          <w:sz w:val="32"/>
+          <w:szCs w:val="32"/>
+        </w:rPr>
+      </w:pPr>
+    </w:p>
+    <w:p>
+      <w:pPr>
+        <w:jc w:val="center"/>
+        <w:rPr>
+          <w:rFonts w:ascii="Times New Roman" w:hAnsi="Times New Roman" w:cs="Times New Roman"/>
+          <w:sz w:val="32"/>
+          <w:szCs w:val="32"/>
+        </w:rPr>
+      </w:pPr>
+    </w:p>
+    <w:p>
+      <w:pPr>
+        <w:jc w:val="center"/>
+        <w:rPr>
+          <w:rFonts w:ascii="Times New Roman" w:hAnsi="Times New Roman" w:cs="Times New Roman"/>
+          <w:sz w:val="32"/>
+          <w:szCs w:val="32"/>
+        </w:rPr>
+      </w:pPr>
+    </w:p>
+    <w:p>
+      <w:pPr>
+        <w:jc w:val="center"/>
+        <w:rPr>
+          <w:rFonts w:ascii="Times New Roman" w:hAnsi="Times New Roman" w:cs="Times New Roman"/>
+          <w:sz w:val="32"/>
+          <w:szCs w:val="32"/>
+        </w:rPr>
+      </w:pPr>
+    </w:p>
+    <w:p>
+      <w:pPr>
+        <w:jc w:val="center"/>
+        <w:rPr>
+          <w:rFonts w:ascii="Times New Roman" w:hAnsi="Times New Roman" w:cs="Times New Roman"/>
+          <w:sz w:val="44"/>
+          <w:szCs w:val="44"/>
+        </w:rPr>
+      </w:pPr>
+      <w:r>
+        <w:rPr>
+          <w:rFonts w:ascii="Times New Roman" w:hAnsi="Times New Roman" w:cs="Times New Roman"/>
+          <w:sz w:val="44"/>
+          <w:szCs w:val="44"/>
+        </w:rPr>
+        <w:lastRenderedPageBreak/>
+        <w:t>Task: 7</w:t>
       </w:r>
     </w:p>
     <w:sectPr>

</xml_diff>

<commit_message>
lab 01 task: 7
</commit_message>
<xml_diff>
--- a/Labs/Lab 1/lab 01 answer doc.docx
+++ b/Labs/Lab 1/lab 01 answer doc.docx
@@ -1610,6 +1610,232 @@
         </w:rPr>
         <w:lastRenderedPageBreak/>
         <w:t>Task: 7</w:t>
+      </w:r>
+    </w:p>
+    <w:p>
+      <w:pPr>
+        <w:jc w:val="center"/>
+        <w:rPr>
+          <w:rFonts w:ascii="Times New Roman" w:hAnsi="Times New Roman" w:cs="Times New Roman"/>
+          <w:sz w:val="32"/>
+          <w:szCs w:val="32"/>
+          <w:lang w:val="en"/>
+        </w:rPr>
+      </w:pPr>
+      <w:r>
+        <w:rPr>
+          <w:rFonts w:ascii="Times New Roman" w:hAnsi="Times New Roman" w:cs="Times New Roman"/>
+          <w:sz w:val="32"/>
+          <w:szCs w:val="32"/>
+          <w:lang w:val="en"/>
+        </w:rPr>
+        <w:t>Read 10 integers into an array. Move the first occurrence of each distinct value into the beginning of the same array, preserving the original order. Display these unique values and their count. Do not use another array.</w:t>
+      </w:r>
+    </w:p>
+    <w:p>
+      <w:pPr>
+        <w:jc w:val="center"/>
+        <w:rPr>
+          <w:rFonts w:ascii="Times New Roman" w:hAnsi="Times New Roman" w:cs="Times New Roman"/>
+          <w:sz w:val="32"/>
+          <w:szCs w:val="32"/>
+          <w:lang w:val="en"/>
+        </w:rPr>
+      </w:pPr>
+      <w:r>
+        <w:rPr>
+          <w:rFonts w:ascii="Times New Roman" w:hAnsi="Times New Roman" w:cs="Times New Roman"/>
+          <w:sz w:val="32"/>
+          <w:szCs w:val="32"/>
+          <w:lang w:val="en"/>
+        </w:rPr>
+        <w:t>Example: {4, 2, 4, 7, 2, 9, 7, 1, 9, 1} produces {4, 2, 7, 9, 1}, with a count of 5.</w:t>
+      </w:r>
+    </w:p>
+    <w:p>
+      <w:pPr>
+        <w:jc w:val="center"/>
+        <w:rPr>
+          <w:rFonts w:ascii="Times New Roman" w:hAnsi="Times New Roman" w:cs="Times New Roman"/>
+          <w:sz w:val="32"/>
+          <w:szCs w:val="32"/>
+          <w:lang w:val="en"/>
+        </w:rPr>
+      </w:pPr>
+      <w:r>
+        <w:rPr>
+          <w:rFonts w:ascii="Times New Roman" w:hAnsi="Times New Roman" w:cs="Times New Roman"/>
+          <w:sz w:val="32"/>
+          <w:szCs w:val="32"/>
+          <w:lang w:val="en"/>
+        </w:rPr>
+        <w:t xml:space="preserve">The array’s physical capacity remains 10; only the first 5 positions represent the result. </w:t>
+      </w:r>
+    </w:p>
+    <w:p>
+      <w:pPr>
+        <w:jc w:val="center"/>
+        <w:rPr>
+          <w:rFonts w:ascii="Times New Roman" w:hAnsi="Times New Roman" w:cs="Times New Roman"/>
+          <w:sz w:val="44"/>
+          <w:szCs w:val="44"/>
+        </w:rPr>
+      </w:pPr>
+    </w:p>
+    <w:p>
+      <w:pPr>
+        <w:jc w:val="center"/>
+        <w:rPr>
+          <w:rFonts w:ascii="Times New Roman" w:hAnsi="Times New Roman" w:cs="Times New Roman"/>
+          <w:sz w:val="44"/>
+          <w:szCs w:val="44"/>
+        </w:rPr>
+      </w:pPr>
+      <w:r>
+        <w:rPr>
+          <w:rFonts w:ascii="Times New Roman" w:hAnsi="Times New Roman" w:cs="Times New Roman"/>
+          <w:sz w:val="44"/>
+          <w:szCs w:val="44"/>
+        </w:rPr>
+        <w:drawing>
+          <wp:inline distT="0" distB="0" distL="0" distR="0" wp14:anchorId="2009D25A" wp14:editId="33D7771A">
+            <wp:extent cx="8077615" cy="8801552"/>
+            <wp:effectExtent l="0" t="0" r="0" b="0"/>
+            <wp:docPr id="462061371" name="Picture 1"/>
+            <wp:cNvGraphicFramePr>
+              <a:graphicFrameLocks xmlns:a="http://schemas.openxmlformats.org/drawingml/2006/main" noChangeAspect="1"/>
+            </wp:cNvGraphicFramePr>
+            <a:graphic xmlns:a="http://schemas.openxmlformats.org/drawingml/2006/main">
+              <a:graphicData uri="http://schemas.openxmlformats.org/drawingml/2006/picture">
+                <pic:pic xmlns:pic="http://schemas.openxmlformats.org/drawingml/2006/picture">
+                  <pic:nvPicPr>
+                    <pic:cNvPr id="462061371" name=""/>
+                    <pic:cNvPicPr/>
+                  </pic:nvPicPr>
+                  <pic:blipFill>
+                    <a:blip r:embed="rId18"/>
+                    <a:stretch>
+                      <a:fillRect/>
+                    </a:stretch>
+                  </pic:blipFill>
+                  <pic:spPr>
+                    <a:xfrm>
+                      <a:off x="0" y="0"/>
+                      <a:ext cx="8077615" cy="8801552"/>
+                    </a:xfrm>
+                    <a:prstGeom prst="rect">
+                      <a:avLst/>
+                    </a:prstGeom>
+                  </pic:spPr>
+                </pic:pic>
+              </a:graphicData>
+            </a:graphic>
+          </wp:inline>
+        </w:drawing>
+      </w:r>
+    </w:p>
+    <w:p>
+      <w:pPr>
+        <w:jc w:val="center"/>
+        <w:rPr>
+          <w:rFonts w:ascii="Times New Roman" w:hAnsi="Times New Roman" w:cs="Times New Roman"/>
+          <w:sz w:val="44"/>
+          <w:szCs w:val="44"/>
+        </w:rPr>
+      </w:pPr>
+      <w:r>
+        <w:rPr>
+          <w:rFonts w:ascii="Times New Roman" w:hAnsi="Times New Roman" w:cs="Times New Roman"/>
+          <w:sz w:val="44"/>
+          <w:szCs w:val="44"/>
+        </w:rPr>
+        <w:drawing>
+          <wp:inline distT="0" distB="0" distL="0" distR="0" wp14:anchorId="4D86B439" wp14:editId="3EC2DADB">
+            <wp:extent cx="6745714" cy="806450"/>
+            <wp:effectExtent l="0" t="0" r="0" b="0"/>
+            <wp:docPr id="1139680263" name="Picture 1"/>
+            <wp:cNvGraphicFramePr>
+              <a:graphicFrameLocks xmlns:a="http://schemas.openxmlformats.org/drawingml/2006/main" noChangeAspect="1"/>
+            </wp:cNvGraphicFramePr>
+            <a:graphic xmlns:a="http://schemas.openxmlformats.org/drawingml/2006/main">
+              <a:graphicData uri="http://schemas.openxmlformats.org/drawingml/2006/picture">
+                <pic:pic xmlns:pic="http://schemas.openxmlformats.org/drawingml/2006/picture">
+                  <pic:nvPicPr>
+                    <pic:cNvPr id="1139680263" name=""/>
+                    <pic:cNvPicPr/>
+                  </pic:nvPicPr>
+                  <pic:blipFill>
+                    <a:blip r:embed="rId19"/>
+                    <a:stretch>
+                      <a:fillRect/>
+                    </a:stretch>
+                  </pic:blipFill>
+                  <pic:spPr>
+                    <a:xfrm>
+                      <a:off x="0" y="0"/>
+                      <a:ext cx="6753592" cy="807392"/>
+                    </a:xfrm>
+                    <a:prstGeom prst="rect">
+                      <a:avLst/>
+                    </a:prstGeom>
+                  </pic:spPr>
+                </pic:pic>
+              </a:graphicData>
+            </a:graphic>
+          </wp:inline>
+        </w:drawing>
+      </w:r>
+    </w:p>
+    <w:p>
+      <w:pPr>
+        <w:jc w:val="center"/>
+        <w:rPr>
+          <w:rFonts w:ascii="Times New Roman" w:hAnsi="Times New Roman" w:cs="Times New Roman"/>
+          <w:sz w:val="44"/>
+          <w:szCs w:val="44"/>
+        </w:rPr>
+      </w:pPr>
+      <w:r>
+        <w:rPr>
+          <w:rFonts w:ascii="Times New Roman" w:hAnsi="Times New Roman" w:cs="Times New Roman"/>
+          <w:sz w:val="44"/>
+          <w:szCs w:val="44"/>
+        </w:rPr>
+        <w:drawing>
+          <wp:inline distT="0" distB="0" distL="0" distR="0" wp14:anchorId="6E1683E0" wp14:editId="07703658">
+            <wp:extent cx="6781797" cy="781050"/>
+            <wp:effectExtent l="0" t="0" r="635" b="0"/>
+            <wp:docPr id="309500637" name="Picture 1"/>
+            <wp:cNvGraphicFramePr>
+              <a:graphicFrameLocks xmlns:a="http://schemas.openxmlformats.org/drawingml/2006/main" noChangeAspect="1"/>
+            </wp:cNvGraphicFramePr>
+            <a:graphic xmlns:a="http://schemas.openxmlformats.org/drawingml/2006/main">
+              <a:graphicData uri="http://schemas.openxmlformats.org/drawingml/2006/picture">
+                <pic:pic xmlns:pic="http://schemas.openxmlformats.org/drawingml/2006/picture">
+                  <pic:nvPicPr>
+                    <pic:cNvPr id="309500637" name=""/>
+                    <pic:cNvPicPr/>
+                  </pic:nvPicPr>
+                  <pic:blipFill>
+                    <a:blip r:embed="rId20"/>
+                    <a:stretch>
+                      <a:fillRect/>
+                    </a:stretch>
+                  </pic:blipFill>
+                  <pic:spPr>
+                    <a:xfrm>
+                      <a:off x="0" y="0"/>
+                      <a:ext cx="6783608" cy="781259"/>
+                    </a:xfrm>
+                    <a:prstGeom prst="rect">
+                      <a:avLst/>
+                    </a:prstGeom>
+                  </pic:spPr>
+                </pic:pic>
+              </a:graphicData>
+            </a:graphic>
+          </wp:inline>
+        </w:drawing>
       </w:r>
     </w:p>
     <w:sectPr>

</xml_diff>